<commit_message>
Concept note: natural wording, no lines
Co-Authored-By: Claude Opus 5.5 <noreply@anthropic.com>
Claude-Session: https://claude.ai/code/session_0132bxCMLAKTHUnyQV3MmGfs
</commit_message>
<xml_diff>
--- a/thesis/Concept_Note_Poudel_MultiSensor_GeoAI.docx
+++ b/thesis/Concept_Note_Poudel_MultiSensor_GeoAI.docx
@@ -92,9 +92,6 @@
     </w:p>
     <w:p>
       <w:pPr>
-        <w:pBdr>
-          <w:bottom w:val="single" w:color="2E5A3F" w:sz="12" w:space="6"/>
-        </w:pBdr>
         <w:spacing w:after="200"/>
       </w:pPr>
       <w:r>
@@ -111,9 +108,6 @@
     <w:p>
       <w:pPr>
         <w:pStyle w:val="Heading1"/>
-        <w:pBdr>
-          <w:bottom w:val="single" w:color="C9D8CD" w:sz="6" w:space="3"/>
-        </w:pBdr>
         <w:spacing w:after="110" w:before="260"/>
       </w:pPr>
       <w:r>
@@ -133,7 +127,7 @@
         <w:jc w:val="both"/>
       </w:pPr>
       <w:r>
-        <w:t xml:space="preserve">Woody plant encroachment — particularly the expansion of eastern redcedar (</w:t>
+        <w:t xml:space="preserve">Eastern redcedar (</w:t>
       </w:r>
       <w:r>
         <w:rPr>
@@ -143,7 +137,7 @@
         <w:t xml:space="preserve">Juniperus virginiana</w:t>
       </w:r>
       <w:r>
-        <w:t xml:space="preserve">) — is transforming grassland–woodland mosaics across the southern Great Plains. Managing it requires tree-level information: where each tree is, how large its crown is, and which species it belongs to. No single sensor provides all three. High-resolution RGB imagery shows crown outlines, LiDAR measures height and three-dimensional structure, and hyperspectral imagery captures the biochemical signature that distinguishes species.</w:t>
+        <w:t xml:space="preserve">) has been spreading into grasslands across the southern Great Plains for decades, largely because fire is less frequent than it used to be. Land managers at places like the LBJ National Grassland want to know where these trees are, how large they are and which species they belong to, but this kind of tree-level information is slow and costly to collect in the field. Each airborne sensor helps in a different way. RGB imagery shows the outline of a crown, LiDAR gives its height and shape, and hyperspectral imagery records spectral differences that can separate one species from another.</w:t>
       </w:r>
     </w:p>
     <w:p>
@@ -152,15 +146,12 @@
         <w:jc w:val="both"/>
       </w:pPr>
       <w:r>
-        <w:t xml:space="preserve">Recent AI methods can exploit these data. Supervised deep-learning detectors such as DeepForest and Mask R-CNN–based Detectree2 were trained mainly in forests (Weinstein et al., 2019, 2020; Ball et al., 2023), while vision foundation models such as the Segment Anything Model (SAM) and SAM 2 segment objects with little task-specific training but need good prompts or elevation data to perform well on trees (Kirillov et al., 2023; Osco et al., 2023; Teng et al., 2025). Hyperspectral data are well established for tree species classification (Fassnacht et al., 2016; Scholl et al., 2021), yet are rarely combined with foundation-model crown delineation. How these methods perform together in open savanna — where crowns are scattered, irregular and surrounded by grass — remains largely unknown.</w:t>
+        <w:t xml:space="preserve">Two groups of AI methods are now used to find individual trees in imagery. The first is supervised deep learning, such as DeepForest and the Mask R-CNN-based Detectree2, which were trained mostly on forest imagery (Weinstein et al., 2019, 2020; Ball et al., 2023). The second is vision foundation models such as the Segment Anything Model (SAM) and SAM 2. These can outline objects without being trained for a specific task, although on trees they work much better when they are given good prompts or elevation data (Kirillov et al., 2023; Osco et al., 2023; Teng et al., 2025). Hyperspectral data have a long record in tree species mapping (Fassnacht et al., 2016; Scholl et al., 2021), but they are seldom combined with foundation-model segmentation. We still know little about how any of these methods behave in an open savanna, where trees are scattered, crowns are uneven and grass fills the space between them.</w:t>
       </w:r>
     </w:p>
     <w:p>
       <w:pPr>
         <w:pStyle w:val="Heading1"/>
-        <w:pBdr>
-          <w:bottom w:val="single" w:color="C9D8CD" w:sz="6" w:space="3"/>
-        </w:pBdr>
         <w:spacing w:after="110" w:before="260"/>
       </w:pPr>
       <w:r>
@@ -192,7 +183,7 @@
         <w:t xml:space="preserve">Ecosystem gap. </w:t>
       </w:r>
       <w:r>
-        <w:t xml:space="preserve">Crown delineation and species mapping methods have been evaluated mostly in closed forests, plantations and urban areas; open Cross Timbers savanna presents a different structure and spectral background.</w:t>
+        <w:t xml:space="preserve">Most tests of crown delineation and species mapping have been carried out in closed forests, plantations or cities. An open Cross Timbers savanna looks quite different, both in its structure and in the spectral background around each tree.</w:t>
       </w:r>
     </w:p>
     <w:p>
@@ -213,7 +204,7 @@
         <w:t xml:space="preserve">Benchmark gap. </w:t>
       </w:r>
       <w:r>
-        <w:t xml:space="preserve">The NEON tree-crown benchmark does not include a reference dataset for the CLBJ site (Weinstein et al., 2021), so locally checked crowns are needed.</w:t>
+        <w:t xml:space="preserve">The NEON tree crown benchmark has no reference data for CLBJ (Weinstein et al., 2021), so crowns at this site need to be checked locally before any method can be evaluated.</w:t>
       </w:r>
     </w:p>
     <w:p>
@@ -234,15 +225,12 @@
         <w:t xml:space="preserve">Integration gap. </w:t>
       </w:r>
       <w:r>
-        <w:t xml:space="preserve">Foundation-model segmentation, LiDAR structure and hyperspectral species information have largely been studied separately. Few studies, to my knowledge, link all three in a single crown-to-species workflow, and none in a savanna undergoing juniper encroachment.</w:t>
+        <w:t xml:space="preserve">Foundation-model segmentation, LiDAR and hyperspectral data are usually studied one at a time. I have found few studies that bring all three into a single workflow from crown to species, and none in a savanna where juniper is expanding.</w:t>
       </w:r>
     </w:p>
     <w:p>
       <w:pPr>
         <w:pStyle w:val="Heading1"/>
-        <w:pBdr>
-          <w:bottom w:val="single" w:color="C9D8CD" w:sz="6" w:space="3"/>
-        </w:pBdr>
         <w:spacing w:after="110" w:before="260"/>
       </w:pPr>
       <w:r>
@@ -269,7 +257,7 @@
         <w:t xml:space="preserve">Aim: </w:t>
       </w:r>
       <w:r>
-        <w:t xml:space="preserve">To develop and evaluate a multi-sensor GeoAI workflow that integrates supervised deep learning, vision foundation models (SAM, SAM 2), LiDAR and hyperspectral imagery to delineate individual tree crowns and map tree species in an open Cross Timbers savanna.</w:t>
+        <w:t xml:space="preserve">My aim is to build and test a workflow that combines supervised deep learning, foundation models (SAM and SAM 2), LiDAR and hyperspectral imagery to outline individual tree crowns and identify their species in an open Cross Timbers savanna.</w:t>
       </w:r>
     </w:p>
     <w:p>
@@ -283,7 +271,7 @@
         <w:jc w:val="both"/>
       </w:pPr>
       <w:r>
-        <w:t xml:space="preserve">Benchmark crown delineation by supervised deep-learning models (DeepForest, Detectree2) and foundation models (SAM, SAM 2) in zero-shot and LiDAR/hyperspectral-guided modes.</w:t>
+        <w:t xml:space="preserve">Compare how well DeepForest, Detectree2, SAM and SAM 2 delineate crowns, running the foundation models both on their own and with guidance from LiDAR and hyperspectral data.</w:t>
       </w:r>
     </w:p>
     <w:p>
@@ -297,7 +285,7 @@
         <w:jc w:val="both"/>
       </w:pPr>
       <w:r>
-        <w:t xml:space="preserve">Build a quality-checked reference crown dataset for CLBJ and assess performance against field-mapped trees and manually delineated crowns.</w:t>
+        <w:t xml:space="preserve">Build a checked set of reference crowns for CLBJ and use it, together with the field-mapped trees, to measure accuracy.</w:t>
       </w:r>
     </w:p>
     <w:p>
@@ -311,7 +299,7 @@
         <w:jc w:val="both"/>
       </w:pPr>
       <w:r>
-        <w:t xml:space="preserve">Classify delineated crowns into post oak, blackjack oak, eastern redcedar and other broadleaf trees using hyperspectral, LiDAR and RGB features, and quantify the contribution of each sensor.</w:t>
+        <w:t xml:space="preserve">Classify the delineated crowns as post oak, blackjack oak, eastern redcedar or other broadleaf, and find out how much each sensor adds.</w:t>
       </w:r>
     </w:p>
     <w:p>
@@ -321,27 +309,15 @@
       </w:pPr>
       <w:r>
         <w:rPr>
-          <w:b/>
-          <w:bCs/>
           <w:i/>
           <w:iCs/>
         </w:rPr>
-        <w:t xml:space="preserve">Optional extension: </w:t>
-      </w:r>
-      <w:r>
-        <w:rPr>
-          <w:i/>
-          <w:iCs/>
-        </w:rPr>
-        <w:t xml:space="preserve">examine changes in eastern redcedar between NEON acquisition years in burned and unburned management units.</w:t>
+        <w:t xml:space="preserve">If time allows, I will also look at how eastern redcedar has changed between NEON flight years in burned and unburned management units.</w:t>
       </w:r>
     </w:p>
     <w:p>
       <w:pPr>
         <w:pStyle w:val="Heading1"/>
-        <w:pBdr>
-          <w:bottom w:val="single" w:color="C9D8CD" w:sz="6" w:space="3"/>
-        </w:pBdr>
         <w:spacing w:after="110" w:before="260"/>
       </w:pPr>
       <w:r>
@@ -538,7 +514,7 @@
                 <w:sz w:val="19"/>
                 <w:szCs w:val="19"/>
               </w:rPr>
-              <w:t xml:space="preserve">How do supervised deep-learning models (DeepForest, Detectree2) and foundation models (SAM, SAM 2) compare for delineating individual tree crowns in an open savanna, with and without LiDAR and hyperspectral guidance?</w:t>
+              <w:t xml:space="preserve">How do supervised deep learning models (DeepForest, Detectree2) and foundation models (SAM, SAM 2) compare for delineating tree crowns in an open savanna, and does LiDAR and hyperspectral guidance improve the foundation models?</w:t>
             </w:r>
           </w:p>
         </w:tc>
@@ -569,7 +545,7 @@
                 <w:sz w:val="19"/>
                 <w:szCs w:val="19"/>
               </w:rPr>
-              <w:t xml:space="preserve">Guided foundation models will outperform their zero-shot forms and rival trained detectors without site-specific training; performance will vary with crown size and isolation.</w:t>
+              <w:t xml:space="preserve">With guidance, SAM and SAM 2 should do clearly better than in zero-shot mode and come close to the trained detectors without site-specific training. Results will probably depend on crown size and on how isolated a tree is.</w:t>
             </w:r>
           </w:p>
         </w:tc>
@@ -638,7 +614,7 @@
                 <w:sz w:val="19"/>
                 <w:szCs w:val="19"/>
               </w:rPr>
-              <w:t xml:space="preserve">How accurately can delineated crowns be classified to species, and how much do hyperspectral, LiDAR and RGB data each contribute?</w:t>
+              <w:t xml:space="preserve">How accurately can the delineated crowns be classified to species, and how much do hyperspectral, LiDAR and RGB data each contribute?</w:t>
             </w:r>
           </w:p>
         </w:tc>
@@ -670,7 +646,7 @@
                 <w:sz w:val="19"/>
                 <w:szCs w:val="19"/>
               </w:rPr>
-              <w:t xml:space="preserve">Hyperspectral data will contribute most to species separation; combining them with LiDAR structure will give the highest accuracy, especially for evergreen redcedar versus deciduous oaks.</w:t>
+              <w:t xml:space="preserve">Hyperspectral data should matter most for telling species apart, and adding LiDAR structure should improve results further, particularly for separating evergreen redcedar from deciduous oaks.</w:t>
             </w:r>
           </w:p>
         </w:tc>
@@ -737,7 +713,7 @@
                 <w:sz w:val="19"/>
                 <w:szCs w:val="19"/>
               </w:rPr>
-              <w:t xml:space="preserve">Where has eastern redcedar expanded between NEON acquisition years, and does change differ between burned and unburned units?</w:t>
+              <w:t xml:space="preserve">Where has eastern redcedar expanded between NEON flight years, and is the change different in burned and unburned units?</w:t>
             </w:r>
           </w:p>
         </w:tc>
@@ -768,7 +744,7 @@
                 <w:sz w:val="19"/>
                 <w:szCs w:val="19"/>
               </w:rPr>
-              <w:t xml:space="preserve">Redcedar has expanded overall, with less expansion in prescribed-burn units.</w:t>
+              <w:t xml:space="preserve">Redcedar cover has increased overall, but less in units that are burned regularly.</w:t>
             </w:r>
           </w:p>
         </w:tc>
@@ -786,15 +762,12 @@
           <w:sz w:val="18"/>
           <w:szCs w:val="18"/>
         </w:rPr>
-        <w:t xml:space="preserve">*Optional; not required for thesis completion.</w:t>
+        <w:t xml:space="preserve">*Optional; the thesis does not depend on it.</w:t>
       </w:r>
     </w:p>
     <w:p>
       <w:pPr>
         <w:pStyle w:val="Heading1"/>
-        <w:pBdr>
-          <w:bottom w:val="single" w:color="C9D8CD" w:sz="6" w:space="3"/>
-        </w:pBdr>
         <w:spacing w:after="110" w:before="260"/>
       </w:pPr>
       <w:r>
@@ -814,7 +787,7 @@
         <w:jc w:val="both"/>
       </w:pPr>
       <w:r>
-        <w:t xml:space="preserve">The study area is the Caddo–Lyndon B. Johnson National Grasslands (NEON site CLBJ), Wise County, Texas, approximately 30 miles northwest of UNT. The landscape is a mosaic of open grassland and post oak–blackjack oak woodland in the West Cross Timbers, managed by the US Forest Service with prescribed fire and cedar removal to limit woody encroachment. NEON flies a single aircraft carrying an RGB camera, LiDAR and an imaging spectrometer over the site, so all three sensors are acquired together and co-registered.</w:t>
+        <w:t xml:space="preserve">The study takes place at the Caddo–Lyndon B. Johnson National Grasslands (NEON site CLBJ) in Wise County, Texas, about 30 miles northwest of UNT. The site lies in the West Cross Timbers and is a patchwork of open grassland and post oak and blackjack oak woodland. The US Forest Service manages it as grassland and uses prescribed fire and cedar removal to keep trees from taking over. NEON surveys the site from a single aircraft carrying an RGB camera, a LiDAR and an imaging spectrometer, so all three datasets are collected at the same time and line up with each other.</w:t>
       </w:r>
     </w:p>
     <w:tbl>
@@ -1331,7 +1304,7 @@
                 <w:sz w:val="19"/>
                 <w:szCs w:val="19"/>
               </w:rPr>
-              <w:t xml:space="preserve">Species classification; vegetation masking</w:t>
+              <w:t xml:space="preserve">Species classification; vegetation mask</w:t>
             </w:r>
           </w:p>
         </w:tc>
@@ -1445,15 +1418,12 @@
           <w:sz w:val="20"/>
           <w:szCs w:val="20"/>
         </w:rPr>
-        <w:t xml:space="preserve">The field data contain 862 live trees ≥ 2 m — mainly post oak (368), eastern redcedar (101) and blackjack oak (99) — of which 517 are stem-mapped. Field points and image-derived crowns are different measurements, and the evaluation will account for this distinction.</w:t>
+        <w:t xml:space="preserve">The NEON field data include 862 live trees at least 2 m tall. Most are post oak (368), eastern redcedar (101) and blackjack oak (99), and 517 of them have mapped stem positions. A stem location recorded in the field is not the same as a crown outline seen from above, and I will take this into account when comparing the two.</w:t>
       </w:r>
     </w:p>
     <w:p>
       <w:pPr>
         <w:pStyle w:val="Heading1"/>
-        <w:pBdr>
-          <w:bottom w:val="single" w:color="C9D8CD" w:sz="6" w:space="3"/>
-        </w:pBdr>
         <w:spacing w:after="110" w:before="260"/>
       </w:pPr>
       <w:r>
@@ -1526,7 +1496,7 @@
           <w:sz w:val="18"/>
           <w:szCs w:val="18"/>
         </w:rPr>
-        <w:t xml:space="preserve">Figure 1. Multi-sensor workflow linking NEON inputs to the research questions; purple marks the hyperspectral contribution.</w:t>
+        <w:t xml:space="preserve">Figure 1. Overview of the workflow and how each step relates to the research questions. Steps that use hyperspectral data are shown in purple.</w:t>
       </w:r>
     </w:p>
     <w:p>
@@ -1547,7 +1517,7 @@
         <w:t xml:space="preserve">Data preparation. </w:t>
       </w:r>
       <w:r>
-        <w:t xml:space="preserve">Use co-acquired 2024 RGB, LiDAR and hyperspectral data (one year and one product version for consistency); remove noisy water-absorption bands; align all layers with field records over representative woodland and grassland plots.</w:t>
+        <w:t xml:space="preserve">I will use RGB, LiDAR and hyperspectral data from the same 2024 flight, keeping to one year and one product version. Noisy water-absorption bands will be removed, and all layers will be aligned with the field records for a set of woodland and grassland plots.</w:t>
       </w:r>
     </w:p>
     <w:p>
@@ -1568,7 +1538,7 @@
         <w:t xml:space="preserve">Crown delineation. </w:t>
       </w:r>
       <w:r>
-        <w:t xml:space="preserve">Run supervised models (DeepForest; Detectree2/Mask R-CNN, pretrained and fine-tuned on local crowns) and foundation models (SAM, SAM 2) in zero-shot mode and guided by LiDAR tree-top prompts, a canopy-height filter (≥ 2 m) and a hyperspectral vegetation mask that removes grass and bare ground.</w:t>
+        <w:t xml:space="preserve">DeepForest and Detectree2 will be run with their pretrained weights and again after fine-tuning on local crowns. SAM and SAM 2 will be run in zero-shot mode and then guided with LiDAR tree tops as prompts, a 2 m canopy height filter and a hyperspectral vegetation mask that removes grass and bare ground.</w:t>
       </w:r>
     </w:p>
     <w:p>
@@ -1586,10 +1556,10 @@
           <w:b/>
           <w:bCs/>
         </w:rPr>
-        <w:t xml:space="preserve">Reference and accuracy. </w:t>
-      </w:r>
-      <w:r>
-        <w:t xml:space="preserve">Delineate ~150–300 reference crowns with quality checks; report detection rate against 517 field-mapped trees, and precision, recall, F1 and IoU against reference crowns, analyzed by crown size and landscape context.</w:t>
+        <w:t xml:space="preserve">Reference data and accuracy. </w:t>
+      </w:r>
+      <w:r>
+        <w:t xml:space="preserve">I will hand-delineate about 150 to 300 crowns and check them carefully. Accuracy will be reported as the share of the 517 field-mapped trees that are detected, and as precision, recall, F1 and IoU against the reference crowns. I will also look at where errors occur, by crown size and by setting (open grassland versus woodland).</w:t>
       </w:r>
     </w:p>
     <w:p>
@@ -1610,7 +1580,7 @@
         <w:t xml:space="preserve">Species classification. </w:t>
       </w:r>
       <w:r>
-        <w:t xml:space="preserve">Extract crown-level mean spectra, vegetation indices and principal components with LiDAR height and structure metrics; train random forest, support vector machine and 1D-CNN classifiers; compare hyperspectral-only, LiDAR-only, RGB-only and fused inputs using spatially separated training and test data.</w:t>
+        <w:t xml:space="preserve">For each crown I will extract the mean spectrum, vegetation indices and principal components, along with LiDAR height and structure metrics. Random forest, support vector machine and 1D-CNN classifiers will be trained on hyperspectral-only, LiDAR-only, RGB-only and combined inputs, with training and test data kept spatially separate.</w:t>
       </w:r>
     </w:p>
     <w:p>
@@ -1619,15 +1589,12 @@
         <w:jc w:val="both"/>
       </w:pPr>
       <w:r>
-        <w:t xml:space="preserve">The primary outcome is the deep learning versus foundation-model crown-delineation benchmark (RQ1), followed by species classification (RQ2). Classes and features will be limited if the reference sample is small. Because hyperspectral pixels are 1 m, very small crowns may be under-represented; this will be reported as a limitation.</w:t>
+        <w:t xml:space="preserve">The main result of the thesis will be the comparison of deep learning and foundation models for crown delineation (RQ1), followed by species classification (RQ2). If the reference sample turns out to be small, I will reduce the number of classes and features. One limitation is that hyperspectral pixels are 1 m, so very small crowns may not be well represented.</w:t>
       </w:r>
     </w:p>
     <w:p>
       <w:pPr>
         <w:pStyle w:val="Heading1"/>
-        <w:pBdr>
-          <w:bottom w:val="single" w:color="C9D8CD" w:sz="6" w:space="3"/>
-        </w:pBdr>
         <w:spacing w:after="110" w:before="260"/>
       </w:pPr>
       <w:r>
@@ -1638,7 +1605,7 @@
           <w:sz w:val="25"/>
           <w:szCs w:val="25"/>
         </w:rPr>
-        <w:t xml:space="preserve">7. Expected Contributions and Novelty</w:t>
+        <w:t xml:space="preserve">7. Expected Contributions</w:t>
       </w:r>
     </w:p>
     <w:p>
@@ -1652,14 +1619,7 @@
         <w:jc w:val="both"/>
       </w:pPr>
       <w:r>
-        <w:rPr>
-          <w:b/>
-          <w:bCs/>
-        </w:rPr>
-        <w:t xml:space="preserve">Integrated workflow: </w:t>
-      </w:r>
-      <w:r>
-        <w:t xml:space="preserve">a systematic benchmark of supervised deep learning versus foundation models (SAM, SAM 2) for crowns in open savanna, and one of the first crown-to-species pipelines linking them with LiDAR and hyperspectral data.</w:t>
+        <w:t xml:space="preserve">A direct comparison of supervised deep learning and foundation models (SAM, SAM 2) for tree crowns in an open savanna, together with a workflow that links them to LiDAR and hyperspectral data, from crown outline to species.</w:t>
       </w:r>
     </w:p>
     <w:p>
@@ -1673,14 +1633,7 @@
         <w:jc w:val="both"/>
       </w:pPr>
       <w:r>
-        <w:rPr>
-          <w:b/>
-          <w:bCs/>
-        </w:rPr>
-        <w:t xml:space="preserve">Sensor value: </w:t>
-      </w:r>
-      <w:r>
-        <w:t xml:space="preserve">evidence on how much each sensor — RGB, LiDAR and hyperspectral — contributes to crown delineation and species identification.</w:t>
+        <w:t xml:space="preserve">A clearer picture of what RGB, LiDAR and hyperspectral data each add to crown delineation and species identification.</w:t>
       </w:r>
     </w:p>
     <w:p>
@@ -1694,14 +1647,7 @@
         <w:jc w:val="both"/>
       </w:pPr>
       <w:r>
-        <w:rPr>
-          <w:b/>
-          <w:bCs/>
-        </w:rPr>
-        <w:t xml:space="preserve">Reference dataset: </w:t>
-      </w:r>
-      <w:r>
-        <w:t xml:space="preserve">a quality-checked crown and species dataset for CLBJ that fills a gap in the NEON benchmark.</w:t>
+        <w:t xml:space="preserve">A checked crown and species dataset for CLBJ that fills the gap in the NEON benchmark and can be shared with other researchers.</w:t>
       </w:r>
     </w:p>
     <w:p>
@@ -1715,22 +1661,12 @@
         <w:jc w:val="both"/>
       </w:pPr>
       <w:r>
-        <w:rPr>
-          <w:b/>
-          <w:bCs/>
-        </w:rPr>
-        <w:t xml:space="preserve">Management relevance: </w:t>
-      </w:r>
-      <w:r>
-        <w:t xml:space="preserve">tree-level oak and redcedar maps to support encroachment monitoring and prescribed-fire planning at LBJ.</w:t>
+        <w:t xml:space="preserve">Tree-level maps of oak and redcedar that could help the Forest Service track encroachment and plan prescribed burns.</w:t>
       </w:r>
     </w:p>
     <w:p>
       <w:pPr>
         <w:pStyle w:val="Heading1"/>
-        <w:pBdr>
-          <w:bottom w:val="single" w:color="C9D8CD" w:sz="6" w:space="3"/>
-        </w:pBdr>
         <w:spacing w:after="110" w:before="260"/>
       </w:pPr>
       <w:r>
@@ -1755,7 +1691,7 @@
         <w:jc w:val="both"/>
       </w:pPr>
       <w:r>
-        <w:t xml:space="preserve">Verified availability of NEON RGB, LiDAR, hyperspectral and field products for CLBJ across multiple years.</w:t>
+        <w:t xml:space="preserve">Checked which NEON RGB, LiDAR, hyperspectral and field products are available for CLBJ, and for which years.</w:t>
       </w:r>
     </w:p>
     <w:p>
@@ -1769,7 +1705,7 @@
         <w:jc w:val="both"/>
       </w:pPr>
       <w:r>
-        <w:t xml:space="preserve">Processed field records: species composition, tree heights and coordinates for 517 mapped trees.</w:t>
+        <w:t xml:space="preserve">Processed the field records to summarize species, tree heights and coordinates for the 517 mapped trees.</w:t>
       </w:r>
     </w:p>
     <w:p>
@@ -1783,7 +1719,7 @@
         <w:jc w:val="both"/>
       </w:pPr>
       <w:r>
-        <w:t xml:space="preserve">Selected five plots spanning woodland and grassland; acquired 2024 RGB and canopy-height tiles covering them.</w:t>
+        <w:t xml:space="preserve">Chose five plots covering both woodland and grassland, and downloaded the 2024 RGB and canopy height tiles that cover them.</w:t>
       </w:r>
     </w:p>
     <w:p>
@@ -1797,15 +1733,12 @@
         <w:jc w:val="both"/>
       </w:pPr>
       <w:r>
-        <w:t xml:space="preserve">Reviewed core literature on DeepForest, Detectree2, SAM/SAM 2, LiDAR-assisted segmentation and hyperspectral species mapping.</w:t>
+        <w:t xml:space="preserve">Read the main papers on DeepForest, Detectree2, SAM and SAM 2, LiDAR-assisted segmentation and hyperspectral species mapping.</w:t>
       </w:r>
     </w:p>
     <w:p>
       <w:pPr>
         <w:pStyle w:val="Heading1"/>
-        <w:pBdr>
-          <w:bottom w:val="single" w:color="C9D8CD" w:sz="6" w:space="3"/>
-        </w:pBdr>
         <w:spacing w:after="110" w:before="260"/>
       </w:pPr>
       <w:r>
@@ -1968,7 +1901,7 @@
                 <w:sz w:val="19"/>
                 <w:szCs w:val="19"/>
               </w:rPr>
-              <w:t xml:space="preserve">Proposal approval; literature review; data preparation including hyperspectral tiles</w:t>
+              <w:t xml:space="preserve">Proposal approval, literature review and data preparation, including hyperspectral tiles</w:t>
             </w:r>
           </w:p>
         </w:tc>
@@ -2037,7 +1970,7 @@
                 <w:sz w:val="19"/>
                 <w:szCs w:val="19"/>
               </w:rPr>
-              <w:t xml:space="preserve">Reference crowns; crown delineation experiments (RQ1)</w:t>
+              <w:t xml:space="preserve">Reference crowns and crown delineation experiments (RQ1)</w:t>
             </w:r>
           </w:p>
         </w:tc>
@@ -2173,7 +2106,7 @@
                 <w:sz w:val="19"/>
                 <w:szCs w:val="19"/>
               </w:rPr>
-              <w:t xml:space="preserve">Optional change analysis (RQ3); synthesis</w:t>
+              <w:t xml:space="preserve">Optional change analysis (RQ3) and synthesis</w:t>
             </w:r>
           </w:p>
         </w:tc>
@@ -2249,9 +2182,6 @@
     <w:p>
       <w:pPr>
         <w:pStyle w:val="Heading1"/>
-        <w:pBdr>
-          <w:bottom w:val="single" w:color="C9D8CD" w:sz="6" w:space="3"/>
-        </w:pBdr>
         <w:spacing w:after="110" w:before="260"/>
       </w:pPr>
       <w:r>

</xml_diff>

<commit_message>
Concept note: site-specific background for LBJ
Co-Authored-By: Claude Opus 5.5 <noreply@anthropic.com>
Claude-Session: https://claude.ai/code/session_0132bxCMLAKTHUnyQV3MmGfs
</commit_message>
<xml_diff>
--- a/thesis/Concept_Note_Poudel_MultiSensor_GeoAI.docx
+++ b/thesis/Concept_Note_Poudel_MultiSensor_GeoAI.docx
@@ -127,7 +127,7 @@
         <w:jc w:val="both"/>
       </w:pPr>
       <w:r>
-        <w:t xml:space="preserve">Eastern redcedar (</w:t>
+        <w:t xml:space="preserve">At the LBJ National Grassland in Wise County, Texas, eastern redcedar (</w:t>
       </w:r>
       <w:r>
         <w:rPr>
@@ -137,7 +137,7 @@
         <w:t xml:space="preserve">Juniperus virginiana</w:t>
       </w:r>
       <w:r>
-        <w:t xml:space="preserve">) has been spreading into grasslands across the southern Great Plains for decades, largely because fire is less frequent than it used to be. Land managers at places like the LBJ National Grassland want to know where these trees are, how large they are and which species they belong to, but this kind of tree-level information is slow and costly to collect in the field. Each airborne sensor helps in a different way. RGB imagery shows the outline of a crown, LiDAR gives its height and shape, and hyperspectral imagery records spectral differences that can separate one species from another.</w:t>
+        <w:t xml:space="preserve">) is moving into open grassland and oak savanna. Parts of the site, such as the Cross Timbers Research Natural Area, are already described as heavily invaded by young juniper (Cross Timbers Project, n.d.). The US Forest Service burns and clears units across the grassland to hold it back; the Denton Creek prescribed-burn project alone covered about 5,635 acres (USDA Forest Service, 2013). To plan this work, managers need to know where each redcedar is and how it is spreading among the post oak and blackjack oak that dominate the site. NEON field surveys at CLBJ have recorded 101 live redcedars taller than 2 m among 862 live trees in 47 plots, but these plots cover only a small part of the grassland. Mapping every tree across the site requires remote sensing.</w:t>
       </w:r>
     </w:p>
     <w:p>
@@ -146,7 +146,16 @@
         <w:jc w:val="both"/>
       </w:pPr>
       <w:r>
-        <w:t xml:space="preserve">Two groups of AI methods are now used to find individual trees in imagery. The first is supervised deep learning, such as DeepForest and the Mask R-CNN-based Detectree2, which were trained mostly on forest imagery (Weinstein et al., 2019, 2020; Ball et al., 2023). The second is vision foundation models such as the Segment Anything Model (SAM) and SAM 2. These can outline objects without being trained for a specific task, although on trees they work much better when they are given good prompts or elevation data (Kirillov et al., 2023; Osco et al., 2023; Teng et al., 2025). Hyperspectral data have a long record in tree species mapping (Fassnacht et al., 2016; Scholl et al., 2021), but they are seldom combined with foundation-model segmentation. We still know little about how any of these methods behave in an open savanna, where trees are scattered, crowns are uneven and grass fills the space between them.</w:t>
+        <w:t xml:space="preserve">NEON’s aircraft collects three types of data over CLBJ in the same flight: 10 cm RGB imagery that shows crown outlines, LiDAR that measures tree height and shape, and 426-band hyperspectral imagery at 1 m that records spectral differences between species. Evergreen redcedar, with its dense, conical crown, should look different from the broad, deciduous crowns of the oaks in all three.</w:t>
+      </w:r>
+    </w:p>
+    <w:p>
+      <w:pPr>
+        <w:spacing w:after="120" w:line="288"/>
+        <w:jc w:val="both"/>
+      </w:pPr>
+      <w:r>
+        <w:t xml:space="preserve">The tools now used to find trees in such data were built for forests. DeepForest was trained on NEON imagery from mostly forested sites (Weinstein et al., 2019, 2020), and Detectree2, based on Mask R-CNN, was developed in tropical forest (Ball et al., 2023). Vision foundation models such as SAM and SAM 2 can segment objects without task-specific training, but they perform unevenly on remote sensing imagery (Osco et al., 2023). On tree crowns in drone imagery, out-of-the-box SAM did not match a trained Mask R-CNN and improved when elevation data were added (Kirillov et al., 2023; Teng et al., 2025). Conditions at CLBJ are different again: crowns are short (about 6–7 m on average), scattered and surrounded by grass, and the site was left out of the NEON crown benchmark because too few trees met its criteria (Weinstein et al., 2021). Hyperspectral data are well established for tree species mapping (Fassnacht et al., 2016; Scholl et al., 2021), but they have rarely been combined with foundation-model segmentation. It is therefore unclear which methods, and which sensors, work best for mapping individual oaks and redcedars in an open savanna like LBJ.</w:t>
       </w:r>
     </w:p>
     <w:p>
@@ -2218,7 +2227,7 @@
           <w:sz w:val="19"/>
           <w:szCs w:val="19"/>
         </w:rPr>
-        <w:t xml:space="preserve">Fassnacht, F. E., et al. (2016). Review of studies on tree species classification from remotely sensed data. Remote Sensing of Environment, 186, 64–87.</w:t>
+        <w:t xml:space="preserve">Cross Timbers Project (n.d.). LBJ National Grasslands, Texas. University of Arkansas. https://xtimbers.uark.edu/?p=27098</w:t>
       </w:r>
     </w:p>
     <w:p>
@@ -2231,7 +2240,7 @@
           <w:sz w:val="19"/>
           <w:szCs w:val="19"/>
         </w:rPr>
-        <w:t xml:space="preserve">Kirillov, A., et al. (2023). Segment Anything. Proceedings of the IEEE/CVF International Conference on Computer Vision (ICCV).</w:t>
+        <w:t xml:space="preserve">Fassnacht, F. E., et al. (2016). Review of studies on tree species classification from remotely sensed data. Remote Sensing of Environment, 186, 64–87.</w:t>
       </w:r>
     </w:p>
     <w:p>
@@ -2244,7 +2253,7 @@
           <w:sz w:val="19"/>
           <w:szCs w:val="19"/>
         </w:rPr>
-        <w:t xml:space="preserve">Osco, L. P., Wu, Q., de Lemos, E. L., et al. (2023). The Segment Anything Model (SAM) for remote sensing applications: From zero to one shot. International Journal of Applied Earth Observation and Geoinformation, 124, 103540.</w:t>
+        <w:t xml:space="preserve">Kirillov, A., et al. (2023). Segment Anything. Proceedings of the IEEE/CVF International Conference on Computer Vision (ICCV).</w:t>
       </w:r>
     </w:p>
     <w:p>
@@ -2257,7 +2266,7 @@
           <w:sz w:val="19"/>
           <w:szCs w:val="19"/>
         </w:rPr>
-        <w:t xml:space="preserve">Scholl, V. M., et al. (2021). Fusion neural networks for plant classification: Learning to combine RGB, hyperspectral, and lidar data. PeerJ, 9, e11790.</w:t>
+        <w:t xml:space="preserve">Osco, L. P., Wu, Q., de Lemos, E. L., et al. (2023). The Segment Anything Model (SAM) for remote sensing applications: From zero to one shot. International Journal of Applied Earth Observation and Geoinformation, 124, 103540.</w:t>
       </w:r>
     </w:p>
     <w:p>
@@ -2270,7 +2279,7 @@
           <w:sz w:val="19"/>
           <w:szCs w:val="19"/>
         </w:rPr>
-        <w:t xml:space="preserve">Teng, M., Ouaknine, A., Laliberté, E., Bengio, Y., Rolnick, D., &amp; Larochelle, H. (2025). Bringing SAM to new heights: Leveraging elevation data for tree crown segmentation from drone imagery. Advances in Neural Information Processing Systems (NeurIPS).</w:t>
+        <w:t xml:space="preserve">Scholl, V. M., et al. (2021). Fusion neural networks for plant classification: Learning to combine RGB, hyperspectral, and lidar data. PeerJ, 9, e11790.</w:t>
       </w:r>
     </w:p>
     <w:p>
@@ -2283,7 +2292,7 @@
           <w:sz w:val="19"/>
           <w:szCs w:val="19"/>
         </w:rPr>
-        <w:t xml:space="preserve">Weinstein, B. G., Marconi, S., Bohlman, S., Zare, A., &amp; White, E. (2019). Individual tree-crown detection in RGB imagery using semi-supervised deep learning neural networks. Remote Sensing, 11(11), 1309.</w:t>
+        <w:t xml:space="preserve">Teng, M., Ouaknine, A., Laliberté, E., Bengio, Y., Rolnick, D., &amp; Larochelle, H. (2025). Bringing SAM to new heights: Leveraging elevation data for tree crown segmentation from drone imagery. Advances in Neural Information Processing Systems (NeurIPS).</w:t>
       </w:r>
     </w:p>
     <w:p>
@@ -2296,7 +2305,7 @@
           <w:sz w:val="19"/>
           <w:szCs w:val="19"/>
         </w:rPr>
-        <w:t xml:space="preserve">Weinstein, B. G., et al. (2020). DeepForest: A Python package for RGB deep learning tree crown delineation. Methods in Ecology and Evolution, 11(12), 1743–1751.</w:t>
+        <w:t xml:space="preserve">Weinstein, B. G., Marconi, S., Bohlman, S., Zare, A., &amp; White, E. (2019). Individual tree-crown detection in RGB imagery using semi-supervised deep learning neural networks. Remote Sensing, 11(11), 1309.</w:t>
       </w:r>
     </w:p>
     <w:p>
@@ -2309,7 +2318,7 @@
           <w:sz w:val="19"/>
           <w:szCs w:val="19"/>
         </w:rPr>
-        <w:t xml:space="preserve">Weinstein, B. G., et al. (2021). A benchmark dataset for canopy crown detection and delineation in co-registered airborne RGB, LiDAR and hyperspectral imagery from the National Ecological Observation Network. PLoS Computational Biology, 17(7), e1009180.</w:t>
+        <w:t xml:space="preserve">Weinstein, B. G., et al. (2020). DeepForest: A Python package for RGB deep learning tree crown delineation. Methods in Ecology and Evolution, 11(12), 1743–1751.</w:t>
       </w:r>
     </w:p>
     <w:p>
@@ -2322,7 +2331,33 @@
           <w:sz w:val="19"/>
           <w:szCs w:val="19"/>
         </w:rPr>
+        <w:t xml:space="preserve">Weinstein, B. G., et al. (2021). A benchmark dataset for canopy crown detection and delineation in co-registered airborne RGB, LiDAR and hyperspectral imagery from the National Ecological Observation Network. PLoS Computational Biology, 17(7), e1009180.</w:t>
+      </w:r>
+    </w:p>
+    <w:p>
+      <w:pPr>
+        <w:spacing w:after="80"/>
+        <w:ind w:left="360" w:hanging="360"/>
+      </w:pPr>
+      <w:r>
+        <w:rPr>
+          <w:sz w:val="19"/>
+          <w:szCs w:val="19"/>
+        </w:rPr>
         <w:t xml:space="preserve">Weinstein, B. G., et al. (2024). Individual canopy tree species maps for the National Ecological Observatory Network. PLoS Biology.</w:t>
+      </w:r>
+    </w:p>
+    <w:p>
+      <w:pPr>
+        <w:spacing w:after="80"/>
+        <w:ind w:left="360" w:hanging="360"/>
+      </w:pPr>
+      <w:r>
+        <w:rPr>
+          <w:sz w:val="19"/>
+          <w:szCs w:val="19"/>
+        </w:rPr>
+        <w:t xml:space="preserve">USDA Forest Service (2013). Prescribed burning of Denton Creek watershed to improve wildlife habitat and decrease hazardous fuels. National Forests and Grasslands in Texas. https://www.fs.usda.gov/r08/texas/projects/41418</w:t>
       </w:r>
     </w:p>
     <w:p>

</xml_diff>